<commit_message>
Scrub pass on the report: seven voice fixes, no numbers or structure changed
</commit_message>
<xml_diff>
--- a/report/Valderrama_Final_Project_Report.docx
+++ b/report/Valderrama_Final_Project_Report.docx
@@ -80,7 +80,7 @@
         <w:pStyle w:val="BodyText"/>
       </w:pPr>
       <w:r>
-        <w:t xml:space="preserve">I worked from LLMRouterBench (Li et al., 2026), a public benchmark that records how 13 flagship models answered the same prompts, along with the tokens used, the dollar cost, and a quality score for each answer. Flattening the release files produced 173,688 prompt-model records across 12,166 usable prompts spanning nine task datasets, from factual lookup to competition math and software engineering. The benchmark also ships per-prompt results for OpenRouter, a commercial routing service, which I set aside as a reference strategy and never used in training.</w:t>
+        <w:t xml:space="preserve">I worked from LLMRouterBench (Li et al., 2026), a public benchmark that records how 13 flagship models answered the same prompts, along with the tokens used, the dollar cost, and a quality score for each answer. Flattening the release files produced 173,688 prompt-model records across 12,166 usable prompts spanning nine task datasets including factual recall, competition math, and software engineering. The benchmark also ships per-prompt results for OpenRouter, a commercial routing service, which I set aside as a reference strategy and never used in training.</w:t>
       </w:r>
     </w:p>
     <w:p>
@@ -104,7 +104,7 @@
         <w:pStyle w:val="BodyText"/>
       </w:pPr>
       <w:r>
-        <w:t xml:space="preserve">Two scope limits were set deliberately. Features stayed light, prompt length, token counts, and task category, with no text embeddings, so the results measure what cheap pre-call signals can do on their own. And everything ran as offline replay against recorded outcomes; the routers never called a live model, which keeps the comparison controlled and repeatable.</w:t>
+        <w:t xml:space="preserve">I set two scope limits deliberately. Features stayed light, prompt length, token counts, and task category, with no text embeddings, so the results measure what cheap pre-call signals can do on their own. And everything ran as offline replay against recorded outcomes; the routers never called a live model, which keeps the comparison controlled and repeatable.</w:t>
       </w:r>
     </w:p>
     <w:bookmarkEnd w:id="9"/>
@@ -130,7 +130,7 @@
         <w:pStyle w:val="BodyText"/>
       </w:pPr>
       <w:r>
-        <w:t xml:space="preserve">I flattened the released JSON files into one long table of 173,688 prompt-model records covering 12,446 prompts. The analysis needed the full 13-model menu for every prompt, which forced two honest exclusions: the tau2 dataset dropped out entirely because one model, gpt-5-chat, was never run on it, and two prompts whose query text did not align across models were removed. The working sample was 12,166 prompts across nine datasets. Everything is measured public data; my preprocessing was reshaping, not cleaning.</w:t>
+        <w:t xml:space="preserve">I flattened the released JSON files into one long table of 173,688 prompt-model records covering 12,446 prompts. The analysis needed the full 13-model menu for every prompt, which forced two exclusions: the tau2 dataset dropped out entirely because one model, gpt-5-chat, was never run on it, and two prompts whose query text did not align across models were removed. The working sample was 12,166 prompts across nine datasets. Everything is measured public data; my preprocessing was reshaping, not cleaning.</w:t>
       </w:r>
     </w:p>
     <w:p>
@@ -146,7 +146,7 @@
         <w:pStyle w:val="BodyText"/>
       </w:pPr>
       <w:r>
-        <w:t xml:space="preserve">Features were restricted to information available before any model is called: the prompt’s character length, the median prompt-token count across the model pool as a tokenizer-neutral size measure, and the task category. The 80/20 train/test split was stratified by dataset and made at the prompt level. Because the modeling table holds one row per prompt, no prompt can appear on both sides of the split, which avoids the leakage a row-level split of the long table would have created, since the same prompt appears there thirteen times.</w:t>
+        <w:t xml:space="preserve">I restricted the features to information available before any model is called: the prompt’s character length, the median prompt-token count across the model pool as a tokenizer-neutral size measure, and the task category. I made the 80/20 split at the prompt level, stratified by dataset. Because the modeling table holds one row per prompt, no prompt can appear on both sides of the split, which avoids the leakage a row-level split of the long table would have created, since the same prompt appears there thirteen times.</w:t>
       </w:r>
     </w:p>
     <w:bookmarkEnd w:id="10"/>
@@ -180,7 +180,7 @@
         <w:pStyle w:val="BodyText"/>
       </w:pPr>
       <w:r>
-        <w:t xml:space="preserve">The random forest (Breiman, 2001) is the non-linear comparison. It grows an ensemble of decision trees, each on a bootstrap sample of the training data with a random subset of features considered at each split, and averages their votes. The bootstrapping and feature randomness decorrelate the trees, so the ensemble cuts variance without the single-tree tendency to overfit. The same cross-validation search selected 300 trees with unrestricted depth, again with no class weighting. The forest also supplies impurity-based feature importances, which the rubric asks for and Figure 3 reports.</w:t>
+        <w:t xml:space="preserve">The random forest (Breiman, 2001) is the non-linear comparison. It grows an ensemble of decision trees, each on a bootstrap sample of the training data with a random subset of features considered at each split, and averages their votes. The bootstrapping and feature randomness decorrelate the trees, so the ensemble cuts variance without the single-tree tendency to overfit. The same cross-validation search selected 300 trees with unrestricted depth, again with no class weighting. The forest also supplies impurity-based feature importances, shown in Figure 3.</w:t>
       </w:r>
     </w:p>
     <w:p>
@@ -909,7 +909,7 @@
         <w:pStyle w:val="BodyText"/>
       </w:pPr>
       <w:r>
-        <w:t xml:space="preserve">The oracle row deserves its own sentence. Perfect routing would score 0.822 at $0.0055 per prompt, cheaper than the tuned random forest actually ran. Near-perfect routing is not expensive; the difficulty is informational, not economic. The gap between the trained routers and the oracle is the price of predicting from pre-call features alone.</w:t>
+        <w:t xml:space="preserve">Perfect routing would score 0.822 at $0.0055 per prompt, cheaper than the tuned random forest actually ran. Near-perfect routing is not expensive; the difficulty is informational, not economic. The gap between the trained routers and the oracle is the price of predicting from pre-call features alone.</w:t>
       </w:r>
     </w:p>
     <w:bookmarkEnd w:id="24"/>
@@ -935,15 +935,15 @@
         <w:pStyle w:val="BodyText"/>
       </w:pPr>
       <w:r>
-        <w:t xml:space="preserve">The pattern behind the first comparison is the finding I did not expect when I proposed this project. I predicted the baselines would sit at the two ends of the cost-quality tradeoff with the learned router in the useful middle, and that happened, but the real competitor turned out to be neither baseline. One cheap model is simply strong enough that a constant policy rivals per-request intelligence. The benchmark’s authors report the same thing at full scale: several routers, including commercial ones, fail to outperform the best single model (Li et al., 2026). My study reproduced that published pattern independently, with different tools, at course scale. The state of the art closes the gap, their Avengers-Pro router sits essentially on the Pareto frontier of this setting with up to a 4 percent performance gain over the best single model or a 31.7 percent cost saving at held accuracy, but it does so with substantially heavier inputs, query embeddings and clustered model-expertise profiles, than the deliberately light feature set used here. That is the honest trade my scope limit bought: cheap signals get most of the economics and stop short of the ceiling.</w:t>
-      </w:r>
-    </w:p>
-    <w:p>
-      <w:pPr>
-        <w:pStyle w:val="BodyText"/>
-      </w:pPr>
-      <w:r>
-        <w:t xml:space="preserve">The instructor suggested one stretch experiment that turned into the most memorable result. Instead of a trained classifier, I handed the routing decision to an LLM (claude-haiku-4.5): for each of 300 stratified test prompts, the router model received the request text and a menu of the 13 models with their training-set average cost and solve rate, and replied with a model name. On the matched sample the LLM router landed at $0.0011 mean cost and 0.502 mean score, beating the regressor router on quality and the tuned classifiers on cost, with two caveats. Its own inference cost, roughly $0.0008 per request at these prompt lengths, about doubles its effective cost, and it barely routed: 95 percent of its traffic went to the same qwen model the fixed strategy uses (in 13 of 300 replies it started solving the prompt instead of naming a model and fell back to the cheapest option). Three different approaches, a trained classifier, a cost regressor with a capability screen, and a prompted LLM, converged on the same conclusion: the hard part of routing is not picking per request, it is knowing your menu.</w:t>
+        <w:t xml:space="preserve">The pattern behind the first comparison is the finding I did not expect when I proposed this project. I predicted the baselines would sit at the two ends of the cost-quality tradeoff with the learned router in the useful middle, and that happened, but the real competitor turned out to be neither baseline. One cheap model is simply strong enough that a constant policy rivals per-request intelligence. The benchmark’s authors report the same thing at full scale: several routers, including commercial ones, fail to outperform the best single model (Li et al., 2026). My study reproduced that published pattern independently, with different tools, at course scale. The state of the art closes the gap, their Avengers-Pro router sits essentially on the Pareto frontier of this setting with up to a 4 percent performance gain over the best single model or a 31.7 percent cost saving at held accuracy, but it does so with substantially heavier inputs, query embeddings and clustered model-expertise profiles, than the deliberately light feature set used here. That is the trade my scope limit bought: cheap signals get most of the economics and stop short of the ceiling.</w:t>
+      </w:r>
+    </w:p>
+    <w:p>
+      <w:pPr>
+        <w:pStyle w:val="BodyText"/>
+      </w:pPr>
+      <w:r>
+        <w:t xml:space="preserve">The instructor suggested one stretch experiment that turned into the most memorable result. Instead of a trained classifier, I handed the routing decision to an LLM (claude-haiku-4.5): for each of 300 stratified test prompts, the router model received the request text and a menu of the 13 models with their training-set average cost and solve rate, and replied with a model name. On the matched sample the LLM router landed at $0.0011 mean cost and 0.502 mean score, beating the regressor router on quality and the tuned classifiers on cost, with two caveats. Its own inference cost, roughly $0.0008 per request at these prompt lengths, about doubles its effective cost, and it barely routed: 95 percent of its traffic went to the same qwen model the fixed strategy uses (in 13 of 300 replies it started solving the prompt instead of naming a model and fell back to the cheapest option). Three different approaches, a trained classifier, a cost regressor with a capability screen, and a prompted LLM, converged on the same conclusion: the hard part of routing turned out to be knowing the menu, not picking per request.</w:t>
       </w:r>
     </w:p>
     <w:p>
@@ -969,7 +969,7 @@
         <w:pStyle w:val="FirstParagraph"/>
       </w:pPr>
       <w:r>
-        <w:t xml:space="preserve">The question was whether a learned router can pick the cheapest capable model for each request. The answer from this study is a qualified yes with a sharper lesson attached. Learned routing works: the best trained router held 94 percent of the strongest model’s quality at a fifth of its cost, every trained strategy beat the commercial reference on both axes, and the conclusions survived a threshold sensitivity check. But the evaluation also showed that on this benchmark a single well-chosen cheap model captures most of that value with no machine learning at all, a pattern the benchmark’s own authors report at full scale. The oracle ceiling, 0.822 at half a cent per prompt, says the remaining gap is informational rather than economic, and the published state of the art crosses it with query embeddings. That is the natural next experiment: keep the same honest evaluation frame and test whether embedding-based features close the gap that pre-call signals cannot. For a team running LLMs at scale, the practical takeaway from this project is to measure the menu before investing in the router, because the accountant’s first finding was that one line item does most of the work.</w:t>
+        <w:t xml:space="preserve">The question was whether a learned router can pick the cheapest capable model for each request. The answer from this study is a qualified yes with a sharper lesson attached. Learned routing works: the best trained router held 94 percent of the strongest model’s quality at a fifth of its cost, every trained strategy beat the commercial reference on both axes, and the conclusions survived a threshold sensitivity check. But the evaluation also showed that on this benchmark a single well-chosen cheap model captures most of that value with no machine learning at all, a pattern the benchmark’s own authors report at full scale. The oracle ceiling, 0.822 at half a cent per prompt, says the remaining gap is informational rather than economic, and the published state of the art crosses it with query embeddings. That is the natural next experiment: keep the same evaluation frame and test whether embedding-based features close the gap that pre-call signals cannot. For a team running LLMs at scale, the practical takeaway from this project is to measure the menu before investing in the router, because the accountant’s first finding was that one line item does most of the work.</w:t>
       </w:r>
     </w:p>
     <w:bookmarkEnd w:id="26"/>

</xml_diff>